<commit_message>
Update table generation tool and reference assets
Replit-Commit-Author: Agent
</commit_message>
<xml_diff>
--- a/vtccp/references/CPIPM-TableStyle-Sample.docx
+++ b/vtccp/references/CPIPM-TableStyle-Sample.docx
@@ -9,7 +9,7 @@
           <w:color w:val="1E3A5F"/>
           <w:sz w:val="26"/>
         </w:rPr>
-        <w:t>CPIPM Table Style Sample — Table 1 (Project Summary)</w:t>
+        <w:t>CPIPM Table Style Sample — row height options</w:t>
       </w:r>
     </w:p>
     <w:p>
@@ -19,12 +19,12 @@
           <w:color w:val="6B7280"/>
           <w:sz w:val="18"/>
         </w:rPr>
-        <w:t>Two options shown below. Reply with A or B (or suggest tweaks).</w:t>
+        <w:t>All three options use the same 9.5 pt font with tight left/right cell margins. The only difference is the minimum row height and vertical centring.</w:t>
       </w:r>
     </w:p>
     <w:p>
       <w:pPr>
-        <w:spacing w:before="160" w:after="60"/>
+        <w:spacing w:before="200" w:after="60"/>
       </w:pPr>
       <w:r>
         <w:rPr>
@@ -32,7 +32,7 @@
           <w:color w:val="1E3A5F"/>
           <w:sz w:val="20"/>
         </w:rPr>
-        <w:t>Option A — current (tight): 9.5 pt, minimal cell padding</w:t>
+        <w:t>Option A — auto height (original style, no minimum)</w:t>
       </w:r>
     </w:p>
     <w:tbl>
@@ -50,17 +50,15 @@
           <w:tcPr>
             <w:tcW w:type="dxa" w:w="2880"/>
             <w:tcMar>
-              <w:top w:w="60" w:type="dxa"/>
-              <w:bottom w:w="60" w:type="dxa"/>
+              <w:top w:w="36" w:type="dxa"/>
+              <w:bottom w:w="36" w:type="dxa"/>
               <w:left w:w="108" w:type="dxa"/>
               <w:right w:w="108" w:type="dxa"/>
             </w:tcMar>
+            <w:vAlign w:val="center"/>
             <w:shd w:val="clear" w:color="auto" w:fill="1E3A5F"/>
           </w:tcPr>
           <w:p>
-            <w:pPr>
-              <w:spacing w:before="20" w:after="20"/>
-            </w:pPr>
             <w:r>
               <w:rPr>
                 <w:b/>
@@ -75,17 +73,15 @@
           <w:tcPr>
             <w:tcW w:type="dxa" w:w="6480"/>
             <w:tcMar>
-              <w:top w:w="60" w:type="dxa"/>
-              <w:bottom w:w="60" w:type="dxa"/>
+              <w:top w:w="36" w:type="dxa"/>
+              <w:bottom w:w="36" w:type="dxa"/>
               <w:left w:w="108" w:type="dxa"/>
               <w:right w:w="108" w:type="dxa"/>
             </w:tcMar>
+            <w:vAlign w:val="center"/>
             <w:shd w:val="clear" w:color="auto" w:fill="1E3A5F"/>
           </w:tcPr>
           <w:p>
-            <w:pPr>
-              <w:spacing w:before="20" w:after="20"/>
-            </w:pPr>
             <w:r>
               <w:rPr>
                 <w:b/>
@@ -102,17 +98,15 @@
           <w:tcPr>
             <w:tcW w:type="dxa" w:w="2880"/>
             <w:tcMar>
-              <w:top w:w="60" w:type="dxa"/>
-              <w:bottom w:w="60" w:type="dxa"/>
+              <w:top w:w="36" w:type="dxa"/>
+              <w:bottom w:w="36" w:type="dxa"/>
               <w:left w:w="108" w:type="dxa"/>
               <w:right w:w="108" w:type="dxa"/>
             </w:tcMar>
+            <w:vAlign w:val="center"/>
             <w:shd w:val="clear" w:color="auto" w:fill="EBF8F7"/>
           </w:tcPr>
           <w:p>
-            <w:pPr>
-              <w:spacing w:before="20" w:after="20"/>
-            </w:pPr>
             <w:r>
               <w:rPr>
                 <w:b/>
@@ -127,17 +121,15 @@
           <w:tcPr>
             <w:tcW w:type="dxa" w:w="6480"/>
             <w:tcMar>
-              <w:top w:w="60" w:type="dxa"/>
-              <w:bottom w:w="60" w:type="dxa"/>
+              <w:top w:w="36" w:type="dxa"/>
+              <w:bottom w:w="36" w:type="dxa"/>
               <w:left w:w="108" w:type="dxa"/>
               <w:right w:w="108" w:type="dxa"/>
             </w:tcMar>
+            <w:vAlign w:val="center"/>
             <w:shd w:val="clear" w:color="auto" w:fill="EBF8F7"/>
           </w:tcPr>
           <w:p>
-            <w:pPr>
-              <w:spacing w:before="20" w:after="20"/>
-            </w:pPr>
             <w:r>
               <w:rPr>
                 <w:color w:val="111827"/>
@@ -153,17 +145,15 @@
           <w:tcPr>
             <w:tcW w:type="dxa" w:w="2880"/>
             <w:tcMar>
-              <w:top w:w="60" w:type="dxa"/>
-              <w:bottom w:w="60" w:type="dxa"/>
+              <w:top w:w="36" w:type="dxa"/>
+              <w:bottom w:w="36" w:type="dxa"/>
               <w:left w:w="108" w:type="dxa"/>
               <w:right w:w="108" w:type="dxa"/>
             </w:tcMar>
+            <w:vAlign w:val="center"/>
             <w:shd w:val="clear" w:color="auto" w:fill="FFFFFF"/>
           </w:tcPr>
           <w:p>
-            <w:pPr>
-              <w:spacing w:before="20" w:after="20"/>
-            </w:pPr>
             <w:r>
               <w:rPr>
                 <w:b/>
@@ -178,17 +168,15 @@
           <w:tcPr>
             <w:tcW w:type="dxa" w:w="6480"/>
             <w:tcMar>
-              <w:top w:w="60" w:type="dxa"/>
-              <w:bottom w:w="60" w:type="dxa"/>
+              <w:top w:w="36" w:type="dxa"/>
+              <w:bottom w:w="36" w:type="dxa"/>
               <w:left w:w="108" w:type="dxa"/>
               <w:right w:w="108" w:type="dxa"/>
             </w:tcMar>
+            <w:vAlign w:val="center"/>
             <w:shd w:val="clear" w:color="auto" w:fill="FFFFFF"/>
           </w:tcPr>
           <w:p>
-            <w:pPr>
-              <w:spacing w:before="20" w:after="20"/>
-            </w:pPr>
             <w:r>
               <w:rPr>
                 <w:color w:val="111827"/>
@@ -204,17 +192,15 @@
           <w:tcPr>
             <w:tcW w:type="dxa" w:w="2880"/>
             <w:tcMar>
-              <w:top w:w="60" w:type="dxa"/>
-              <w:bottom w:w="60" w:type="dxa"/>
+              <w:top w:w="36" w:type="dxa"/>
+              <w:bottom w:w="36" w:type="dxa"/>
               <w:left w:w="108" w:type="dxa"/>
               <w:right w:w="108" w:type="dxa"/>
             </w:tcMar>
+            <w:vAlign w:val="center"/>
             <w:shd w:val="clear" w:color="auto" w:fill="EBF8F7"/>
           </w:tcPr>
           <w:p>
-            <w:pPr>
-              <w:spacing w:before="20" w:after="20"/>
-            </w:pPr>
             <w:r>
               <w:rPr>
                 <w:b/>
@@ -229,17 +215,15 @@
           <w:tcPr>
             <w:tcW w:type="dxa" w:w="6480"/>
             <w:tcMar>
-              <w:top w:w="60" w:type="dxa"/>
-              <w:bottom w:w="60" w:type="dxa"/>
+              <w:top w:w="36" w:type="dxa"/>
+              <w:bottom w:w="36" w:type="dxa"/>
               <w:left w:w="108" w:type="dxa"/>
               <w:right w:w="108" w:type="dxa"/>
             </w:tcMar>
+            <w:vAlign w:val="center"/>
             <w:shd w:val="clear" w:color="auto" w:fill="EBF8F7"/>
           </w:tcPr>
           <w:p>
-            <w:pPr>
-              <w:spacing w:before="20" w:after="20"/>
-            </w:pPr>
             <w:r>
               <w:rPr>
                 <w:color w:val="111827"/>
@@ -255,17 +239,15 @@
           <w:tcPr>
             <w:tcW w:type="dxa" w:w="2880"/>
             <w:tcMar>
-              <w:top w:w="60" w:type="dxa"/>
-              <w:bottom w:w="60" w:type="dxa"/>
+              <w:top w:w="36" w:type="dxa"/>
+              <w:bottom w:w="36" w:type="dxa"/>
               <w:left w:w="108" w:type="dxa"/>
               <w:right w:w="108" w:type="dxa"/>
             </w:tcMar>
+            <w:vAlign w:val="center"/>
             <w:shd w:val="clear" w:color="auto" w:fill="FFFFFF"/>
           </w:tcPr>
           <w:p>
-            <w:pPr>
-              <w:spacing w:before="20" w:after="20"/>
-            </w:pPr>
             <w:r>
               <w:rPr>
                 <w:b/>
@@ -280,17 +262,15 @@
           <w:tcPr>
             <w:tcW w:type="dxa" w:w="6480"/>
             <w:tcMar>
-              <w:top w:w="60" w:type="dxa"/>
-              <w:bottom w:w="60" w:type="dxa"/>
+              <w:top w:w="36" w:type="dxa"/>
+              <w:bottom w:w="36" w:type="dxa"/>
               <w:left w:w="108" w:type="dxa"/>
               <w:right w:w="108" w:type="dxa"/>
             </w:tcMar>
+            <w:vAlign w:val="center"/>
             <w:shd w:val="clear" w:color="auto" w:fill="FFFFFF"/>
           </w:tcPr>
           <w:p>
-            <w:pPr>
-              <w:spacing w:before="20" w:after="20"/>
-            </w:pPr>
             <w:r>
               <w:rPr>
                 <w:color w:val="111827"/>
@@ -306,17 +286,15 @@
           <w:tcPr>
             <w:tcW w:type="dxa" w:w="2880"/>
             <w:tcMar>
-              <w:top w:w="60" w:type="dxa"/>
-              <w:bottom w:w="60" w:type="dxa"/>
+              <w:top w:w="36" w:type="dxa"/>
+              <w:bottom w:w="36" w:type="dxa"/>
               <w:left w:w="108" w:type="dxa"/>
               <w:right w:w="108" w:type="dxa"/>
             </w:tcMar>
+            <w:vAlign w:val="center"/>
             <w:shd w:val="clear" w:color="auto" w:fill="EBF8F7"/>
           </w:tcPr>
           <w:p>
-            <w:pPr>
-              <w:spacing w:before="20" w:after="20"/>
-            </w:pPr>
             <w:r>
               <w:rPr>
                 <w:b/>
@@ -331,17 +309,15 @@
           <w:tcPr>
             <w:tcW w:type="dxa" w:w="6480"/>
             <w:tcMar>
-              <w:top w:w="60" w:type="dxa"/>
-              <w:bottom w:w="60" w:type="dxa"/>
+              <w:top w:w="36" w:type="dxa"/>
+              <w:bottom w:w="36" w:type="dxa"/>
               <w:left w:w="108" w:type="dxa"/>
               <w:right w:w="108" w:type="dxa"/>
             </w:tcMar>
+            <w:vAlign w:val="center"/>
             <w:shd w:val="clear" w:color="auto" w:fill="EBF8F7"/>
           </w:tcPr>
           <w:p>
-            <w:pPr>
-              <w:spacing w:before="20" w:after="20"/>
-            </w:pPr>
             <w:r>
               <w:rPr>
                 <w:color w:val="111827"/>
@@ -357,17 +333,15 @@
           <w:tcPr>
             <w:tcW w:type="dxa" w:w="2880"/>
             <w:tcMar>
-              <w:top w:w="60" w:type="dxa"/>
-              <w:bottom w:w="60" w:type="dxa"/>
+              <w:top w:w="36" w:type="dxa"/>
+              <w:bottom w:w="36" w:type="dxa"/>
               <w:left w:w="108" w:type="dxa"/>
               <w:right w:w="108" w:type="dxa"/>
             </w:tcMar>
+            <w:vAlign w:val="center"/>
             <w:shd w:val="clear" w:color="auto" w:fill="FFFFFF"/>
           </w:tcPr>
           <w:p>
-            <w:pPr>
-              <w:spacing w:before="20" w:after="20"/>
-            </w:pPr>
             <w:r>
               <w:rPr>
                 <w:b/>
@@ -382,17 +356,15 @@
           <w:tcPr>
             <w:tcW w:type="dxa" w:w="6480"/>
             <w:tcMar>
-              <w:top w:w="60" w:type="dxa"/>
-              <w:bottom w:w="60" w:type="dxa"/>
+              <w:top w:w="36" w:type="dxa"/>
+              <w:bottom w:w="36" w:type="dxa"/>
               <w:left w:w="108" w:type="dxa"/>
               <w:right w:w="108" w:type="dxa"/>
             </w:tcMar>
+            <w:vAlign w:val="center"/>
             <w:shd w:val="clear" w:color="auto" w:fill="FFFFFF"/>
           </w:tcPr>
           <w:p>
-            <w:pPr>
-              <w:spacing w:before="20" w:after="20"/>
-            </w:pPr>
             <w:r>
               <w:rPr>
                 <w:color w:val="111827"/>
@@ -408,17 +380,15 @@
           <w:tcPr>
             <w:tcW w:type="dxa" w:w="2880"/>
             <w:tcMar>
-              <w:top w:w="60" w:type="dxa"/>
-              <w:bottom w:w="60" w:type="dxa"/>
+              <w:top w:w="36" w:type="dxa"/>
+              <w:bottom w:w="36" w:type="dxa"/>
               <w:left w:w="108" w:type="dxa"/>
               <w:right w:w="108" w:type="dxa"/>
             </w:tcMar>
+            <w:vAlign w:val="center"/>
             <w:shd w:val="clear" w:color="auto" w:fill="EBF8F7"/>
           </w:tcPr>
           <w:p>
-            <w:pPr>
-              <w:spacing w:before="20" w:after="20"/>
-            </w:pPr>
             <w:r>
               <w:rPr>
                 <w:b/>
@@ -433,17 +403,15 @@
           <w:tcPr>
             <w:tcW w:type="dxa" w:w="6480"/>
             <w:tcMar>
-              <w:top w:w="60" w:type="dxa"/>
-              <w:bottom w:w="60" w:type="dxa"/>
+              <w:top w:w="36" w:type="dxa"/>
+              <w:bottom w:w="36" w:type="dxa"/>
               <w:left w:w="108" w:type="dxa"/>
               <w:right w:w="108" w:type="dxa"/>
             </w:tcMar>
+            <w:vAlign w:val="center"/>
             <w:shd w:val="clear" w:color="auto" w:fill="EBF8F7"/>
           </w:tcPr>
           <w:p>
-            <w:pPr>
-              <w:spacing w:before="20" w:after="20"/>
-            </w:pPr>
             <w:r>
               <w:rPr>
                 <w:color w:val="111827"/>
@@ -459,17 +427,15 @@
           <w:tcPr>
             <w:tcW w:type="dxa" w:w="2880"/>
             <w:tcMar>
-              <w:top w:w="60" w:type="dxa"/>
-              <w:bottom w:w="60" w:type="dxa"/>
+              <w:top w:w="36" w:type="dxa"/>
+              <w:bottom w:w="36" w:type="dxa"/>
               <w:left w:w="108" w:type="dxa"/>
               <w:right w:w="108" w:type="dxa"/>
             </w:tcMar>
+            <w:vAlign w:val="center"/>
             <w:shd w:val="clear" w:color="auto" w:fill="FFFFFF"/>
           </w:tcPr>
           <w:p>
-            <w:pPr>
-              <w:spacing w:before="20" w:after="20"/>
-            </w:pPr>
             <w:r>
               <w:rPr>
                 <w:b/>
@@ -484,17 +450,15 @@
           <w:tcPr>
             <w:tcW w:type="dxa" w:w="6480"/>
             <w:tcMar>
-              <w:top w:w="60" w:type="dxa"/>
-              <w:bottom w:w="60" w:type="dxa"/>
+              <w:top w:w="36" w:type="dxa"/>
+              <w:bottom w:w="36" w:type="dxa"/>
               <w:left w:w="108" w:type="dxa"/>
               <w:right w:w="108" w:type="dxa"/>
             </w:tcMar>
+            <w:vAlign w:val="center"/>
             <w:shd w:val="clear" w:color="auto" w:fill="FFFFFF"/>
           </w:tcPr>
           <w:p>
-            <w:pPr>
-              <w:spacing w:before="20" w:after="20"/>
-            </w:pPr>
             <w:r>
               <w:rPr>
                 <w:color w:val="111827"/>
@@ -509,7 +473,7 @@
     <w:p/>
     <w:p>
       <w:pPr>
-        <w:spacing w:before="160" w:after="60"/>
+        <w:spacing w:before="200" w:after="60"/>
       </w:pPr>
       <w:r>
         <w:rPr>
@@ -517,7 +481,7 @@
           <w:color w:val="1E3A5F"/>
           <w:sz w:val="20"/>
         </w:rPr>
-        <w:t>Option B — proposed (open): 10 pt, increased cell padding</w:t>
+        <w:t>Option B — min row height 0.30 in, text centred  (≈ +100% on single-line rows)</w:t>
       </w:r>
     </w:p>
     <w:tbl>
@@ -531,26 +495,27 @@
         <w:gridCol w:w="4680"/>
       </w:tblGrid>
       <w:tr>
+        <w:trPr>
+          <w:trHeight w:val="432" w:hRule="atLeast"/>
+        </w:trPr>
         <w:tc>
           <w:tcPr>
             <w:tcW w:type="dxa" w:w="2880"/>
             <w:tcMar>
-              <w:top w:w="120" w:type="dxa"/>
-              <w:bottom w:w="120" w:type="dxa"/>
+              <w:top w:w="36" w:type="dxa"/>
+              <w:bottom w:w="36" w:type="dxa"/>
               <w:left w:w="108" w:type="dxa"/>
               <w:right w:w="108" w:type="dxa"/>
             </w:tcMar>
+            <w:vAlign w:val="center"/>
             <w:shd w:val="clear" w:color="auto" w:fill="1E3A5F"/>
           </w:tcPr>
           <w:p>
-            <w:pPr>
-              <w:spacing w:before="40" w:after="40"/>
-            </w:pPr>
             <w:r>
               <w:rPr>
                 <w:b/>
                 <w:color w:val="FFFFFF"/>
-                <w:sz w:val="20"/>
+                <w:sz w:val="19"/>
               </w:rPr>
               <w:t>Parameter</w:t>
             </w:r>
@@ -560,22 +525,20 @@
           <w:tcPr>
             <w:tcW w:type="dxa" w:w="6480"/>
             <w:tcMar>
-              <w:top w:w="120" w:type="dxa"/>
-              <w:bottom w:w="120" w:type="dxa"/>
+              <w:top w:w="36" w:type="dxa"/>
+              <w:bottom w:w="36" w:type="dxa"/>
               <w:left w:w="108" w:type="dxa"/>
               <w:right w:w="108" w:type="dxa"/>
             </w:tcMar>
+            <w:vAlign w:val="center"/>
             <w:shd w:val="clear" w:color="auto" w:fill="1E3A5F"/>
           </w:tcPr>
           <w:p>
-            <w:pPr>
-              <w:spacing w:before="40" w:after="40"/>
-            </w:pPr>
             <w:r>
               <w:rPr>
                 <w:b/>
                 <w:color w:val="FFFFFF"/>
-                <w:sz w:val="20"/>
+                <w:sz w:val="19"/>
               </w:rPr>
               <w:t>Value</w:t>
             </w:r>
@@ -583,26 +546,27 @@
         </w:tc>
       </w:tr>
       <w:tr>
+        <w:trPr>
+          <w:trHeight w:val="432" w:hRule="atLeast"/>
+        </w:trPr>
         <w:tc>
           <w:tcPr>
             <w:tcW w:type="dxa" w:w="2880"/>
             <w:tcMar>
-              <w:top w:w="120" w:type="dxa"/>
-              <w:bottom w:w="120" w:type="dxa"/>
+              <w:top w:w="36" w:type="dxa"/>
+              <w:bottom w:w="36" w:type="dxa"/>
               <w:left w:w="108" w:type="dxa"/>
               <w:right w:w="108" w:type="dxa"/>
             </w:tcMar>
+            <w:vAlign w:val="center"/>
             <w:shd w:val="clear" w:color="auto" w:fill="EBF8F7"/>
           </w:tcPr>
           <w:p>
-            <w:pPr>
-              <w:spacing w:before="40" w:after="40"/>
-            </w:pPr>
             <w:r>
               <w:rPr>
                 <w:b/>
                 <w:color w:val="1E3A5F"/>
-                <w:sz w:val="20"/>
+                <w:sz w:val="19"/>
               </w:rPr>
               <w:t>Target application</w:t>
             </w:r>
@@ -612,21 +576,19 @@
           <w:tcPr>
             <w:tcW w:type="dxa" w:w="6480"/>
             <w:tcMar>
-              <w:top w:w="120" w:type="dxa"/>
-              <w:bottom w:w="120" w:type="dxa"/>
+              <w:top w:w="36" w:type="dxa"/>
+              <w:bottom w:w="36" w:type="dxa"/>
               <w:left w:w="108" w:type="dxa"/>
               <w:right w:w="108" w:type="dxa"/>
             </w:tcMar>
+            <w:vAlign w:val="center"/>
             <w:shd w:val="clear" w:color="auto" w:fill="EBF8F7"/>
           </w:tcPr>
           <w:p>
-            <w:pPr>
-              <w:spacing w:before="40" w:after="40"/>
-            </w:pPr>
             <w:r>
               <w:rPr>
                 <w:color w:val="111827"/>
-                <w:sz w:val="20"/>
+                <w:sz w:val="19"/>
               </w:rPr>
               <w:t>UDI labeling inline inspection — single station, single scan lane</w:t>
             </w:r>
@@ -634,26 +596,27 @@
         </w:tc>
       </w:tr>
       <w:tr>
+        <w:trPr>
+          <w:trHeight w:val="432" w:hRule="atLeast"/>
+        </w:trPr>
         <w:tc>
           <w:tcPr>
             <w:tcW w:type="dxa" w:w="2880"/>
             <w:tcMar>
-              <w:top w:w="120" w:type="dxa"/>
-              <w:bottom w:w="120" w:type="dxa"/>
+              <w:top w:w="36" w:type="dxa"/>
+              <w:bottom w:w="36" w:type="dxa"/>
               <w:left w:w="108" w:type="dxa"/>
               <w:right w:w="108" w:type="dxa"/>
             </w:tcMar>
+            <w:vAlign w:val="center"/>
             <w:shd w:val="clear" w:color="auto" w:fill="FFFFFF"/>
           </w:tcPr>
           <w:p>
-            <w:pPr>
-              <w:spacing w:before="40" w:after="40"/>
-            </w:pPr>
             <w:r>
               <w:rPr>
                 <w:b/>
                 <w:color w:val="1E3A5F"/>
-                <w:sz w:val="20"/>
+                <w:sz w:val="19"/>
               </w:rPr>
               <w:t>Scanner</w:t>
             </w:r>
@@ -663,21 +626,19 @@
           <w:tcPr>
             <w:tcW w:type="dxa" w:w="6480"/>
             <w:tcMar>
-              <w:top w:w="120" w:type="dxa"/>
-              <w:bottom w:w="120" w:type="dxa"/>
+              <w:top w:w="36" w:type="dxa"/>
+              <w:bottom w:w="36" w:type="dxa"/>
               <w:left w:w="108" w:type="dxa"/>
               <w:right w:w="108" w:type="dxa"/>
             </w:tcMar>
+            <w:vAlign w:val="center"/>
             <w:shd w:val="clear" w:color="auto" w:fill="FFFFFF"/>
           </w:tcPr>
           <w:p>
-            <w:pPr>
-              <w:spacing w:before="40" w:after="40"/>
-            </w:pPr>
             <w:r>
               <w:rPr>
                 <w:color w:val="111827"/>
-                <w:sz w:val="20"/>
+                <w:sz w:val="19"/>
               </w:rPr>
               <w:t>Cognex DM-475V-LBL on desktop stand adapted for conveyor use</w:t>
             </w:r>
@@ -685,26 +646,27 @@
         </w:tc>
       </w:tr>
       <w:tr>
+        <w:trPr>
+          <w:trHeight w:val="432" w:hRule="atLeast"/>
+        </w:trPr>
         <w:tc>
           <w:tcPr>
             <w:tcW w:type="dxa" w:w="2880"/>
             <w:tcMar>
-              <w:top w:w="120" w:type="dxa"/>
-              <w:bottom w:w="120" w:type="dxa"/>
+              <w:top w:w="36" w:type="dxa"/>
+              <w:bottom w:w="36" w:type="dxa"/>
               <w:left w:w="108" w:type="dxa"/>
               <w:right w:w="108" w:type="dxa"/>
             </w:tcMar>
+            <w:vAlign w:val="center"/>
             <w:shd w:val="clear" w:color="auto" w:fill="EBF8F7"/>
           </w:tcPr>
           <w:p>
-            <w:pPr>
-              <w:spacing w:before="40" w:after="40"/>
-            </w:pPr>
             <w:r>
               <w:rPr>
                 <w:b/>
                 <w:color w:val="1E3A5F"/>
-                <w:sz w:val="20"/>
+                <w:sz w:val="19"/>
               </w:rPr>
               <w:t>Barcode type</w:t>
             </w:r>
@@ -714,21 +676,19 @@
           <w:tcPr>
             <w:tcW w:type="dxa" w:w="6480"/>
             <w:tcMar>
-              <w:top w:w="120" w:type="dxa"/>
-              <w:bottom w:w="120" w:type="dxa"/>
+              <w:top w:w="36" w:type="dxa"/>
+              <w:bottom w:w="36" w:type="dxa"/>
               <w:left w:w="108" w:type="dxa"/>
               <w:right w:w="108" w:type="dxa"/>
             </w:tcMar>
+            <w:vAlign w:val="center"/>
             <w:shd w:val="clear" w:color="auto" w:fill="EBF8F7"/>
           </w:tcPr>
           <w:p>
-            <w:pPr>
-              <w:spacing w:before="40" w:after="40"/>
-            </w:pPr>
             <w:r>
               <w:rPr>
                 <w:color w:val="111827"/>
-                <w:sz w:val="20"/>
+                <w:sz w:val="19"/>
               </w:rPr>
               <w:t>GS1 DataMatrix only</w:t>
             </w:r>
@@ -736,26 +696,27 @@
         </w:tc>
       </w:tr>
       <w:tr>
+        <w:trPr>
+          <w:trHeight w:val="432" w:hRule="atLeast"/>
+        </w:trPr>
         <w:tc>
           <w:tcPr>
             <w:tcW w:type="dxa" w:w="2880"/>
             <w:tcMar>
-              <w:top w:w="120" w:type="dxa"/>
-              <w:bottom w:w="120" w:type="dxa"/>
+              <w:top w:w="36" w:type="dxa"/>
+              <w:bottom w:w="36" w:type="dxa"/>
               <w:left w:w="108" w:type="dxa"/>
               <w:right w:w="108" w:type="dxa"/>
             </w:tcMar>
+            <w:vAlign w:val="center"/>
             <w:shd w:val="clear" w:color="auto" w:fill="FFFFFF"/>
           </w:tcPr>
           <w:p>
-            <w:pPr>
-              <w:spacing w:before="40" w:after="40"/>
-            </w:pPr>
             <w:r>
               <w:rPr>
                 <w:b/>
                 <w:color w:val="1E3A5F"/>
-                <w:sz w:val="20"/>
+                <w:sz w:val="19"/>
               </w:rPr>
               <w:t>Trigger mode</w:t>
             </w:r>
@@ -765,21 +726,19 @@
           <w:tcPr>
             <w:tcW w:type="dxa" w:w="6480"/>
             <w:tcMar>
-              <w:top w:w="120" w:type="dxa"/>
-              <w:bottom w:w="120" w:type="dxa"/>
+              <w:top w:w="36" w:type="dxa"/>
+              <w:bottom w:w="36" w:type="dxa"/>
               <w:left w:w="108" w:type="dxa"/>
               <w:right w:w="108" w:type="dxa"/>
             </w:tcMar>
+            <w:vAlign w:val="center"/>
             <w:shd w:val="clear" w:color="auto" w:fill="FFFFFF"/>
           </w:tcPr>
           <w:p>
-            <w:pPr>
-              <w:spacing w:before="40" w:after="40"/>
-            </w:pPr>
             <w:r>
               <w:rPr>
                 <w:color w:val="111827"/>
-                <w:sz w:val="20"/>
+                <w:sz w:val="19"/>
               </w:rPr>
               <w:t>Photosensor hardware item-presence (default); auto-cycle and manual also supported</w:t>
             </w:r>
@@ -787,26 +746,27 @@
         </w:tc>
       </w:tr>
       <w:tr>
+        <w:trPr>
+          <w:trHeight w:val="432" w:hRule="atLeast"/>
+        </w:trPr>
         <w:tc>
           <w:tcPr>
             <w:tcW w:type="dxa" w:w="2880"/>
             <w:tcMar>
-              <w:top w:w="120" w:type="dxa"/>
-              <w:bottom w:w="120" w:type="dxa"/>
+              <w:top w:w="36" w:type="dxa"/>
+              <w:bottom w:w="36" w:type="dxa"/>
               <w:left w:w="108" w:type="dxa"/>
               <w:right w:w="108" w:type="dxa"/>
             </w:tcMar>
+            <w:vAlign w:val="center"/>
             <w:shd w:val="clear" w:color="auto" w:fill="EBF8F7"/>
           </w:tcPr>
           <w:p>
-            <w:pPr>
-              <w:spacing w:before="40" w:after="40"/>
-            </w:pPr>
             <w:r>
               <w:rPr>
                 <w:b/>
                 <w:color w:val="1E3A5F"/>
-                <w:sz w:val="20"/>
+                <w:sz w:val="19"/>
               </w:rPr>
               <w:t>Indicator pole</w:t>
             </w:r>
@@ -816,21 +776,19 @@
           <w:tcPr>
             <w:tcW w:type="dxa" w:w="6480"/>
             <w:tcMar>
-              <w:top w:w="120" w:type="dxa"/>
-              <w:bottom w:w="120" w:type="dxa"/>
+              <w:top w:w="36" w:type="dxa"/>
+              <w:bottom w:w="36" w:type="dxa"/>
               <w:left w:w="108" w:type="dxa"/>
               <w:right w:w="108" w:type="dxa"/>
             </w:tcMar>
+            <w:vAlign w:val="center"/>
             <w:shd w:val="clear" w:color="auto" w:fill="EBF8F7"/>
           </w:tcPr>
           <w:p>
-            <w:pPr>
-              <w:spacing w:before="40" w:after="40"/>
-            </w:pPr>
             <w:r>
               <w:rPr>
                 <w:color w:val="111827"/>
-                <w:sz w:val="20"/>
+                <w:sz w:val="19"/>
               </w:rPr>
               <w:t>3–5 segment light pole with per-color steady/flash states; audible alarm — TBD Engineering</w:t>
             </w:r>
@@ -838,26 +796,27 @@
         </w:tc>
       </w:tr>
       <w:tr>
+        <w:trPr>
+          <w:trHeight w:val="432" w:hRule="atLeast"/>
+        </w:trPr>
         <w:tc>
           <w:tcPr>
             <w:tcW w:type="dxa" w:w="2880"/>
             <w:tcMar>
-              <w:top w:w="120" w:type="dxa"/>
-              <w:bottom w:w="120" w:type="dxa"/>
+              <w:top w:w="36" w:type="dxa"/>
+              <w:bottom w:w="36" w:type="dxa"/>
               <w:left w:w="108" w:type="dxa"/>
               <w:right w:w="108" w:type="dxa"/>
             </w:tcMar>
+            <w:vAlign w:val="center"/>
             <w:shd w:val="clear" w:color="auto" w:fill="FFFFFF"/>
           </w:tcPr>
           <w:p>
-            <w:pPr>
-              <w:spacing w:before="40" w:after="40"/>
-            </w:pPr>
             <w:r>
               <w:rPr>
                 <w:b/>
                 <w:color w:val="1E3A5F"/>
-                <w:sz w:val="20"/>
+                <w:sz w:val="19"/>
               </w:rPr>
               <w:t>Conveyor control</w:t>
             </w:r>
@@ -867,21 +826,19 @@
           <w:tcPr>
             <w:tcW w:type="dxa" w:w="6480"/>
             <w:tcMar>
-              <w:top w:w="120" w:type="dxa"/>
-              <w:bottom w:w="120" w:type="dxa"/>
+              <w:top w:w="36" w:type="dxa"/>
+              <w:bottom w:w="36" w:type="dxa"/>
               <w:left w:w="108" w:type="dxa"/>
               <w:right w:w="108" w:type="dxa"/>
             </w:tcMar>
+            <w:vAlign w:val="center"/>
             <w:shd w:val="clear" w:color="auto" w:fill="FFFFFF"/>
           </w:tcPr>
           <w:p>
-            <w:pPr>
-              <w:spacing w:before="40" w:after="40"/>
-            </w:pPr>
             <w:r>
               <w:rPr>
                 <w:color w:val="111827"/>
-                <w:sz w:val="20"/>
+                <w:sz w:val="19"/>
               </w:rPr>
               <w:t>Pusher divert on fail; line-stop behaviour TBD Engineering</w:t>
             </w:r>
@@ -889,26 +846,27 @@
         </w:tc>
       </w:tr>
       <w:tr>
+        <w:trPr>
+          <w:trHeight w:val="432" w:hRule="atLeast"/>
+        </w:trPr>
         <w:tc>
           <w:tcPr>
             <w:tcW w:type="dxa" w:w="2880"/>
             <w:tcMar>
-              <w:top w:w="120" w:type="dxa"/>
-              <w:bottom w:w="120" w:type="dxa"/>
+              <w:top w:w="36" w:type="dxa"/>
+              <w:bottom w:w="36" w:type="dxa"/>
               <w:left w:w="108" w:type="dxa"/>
               <w:right w:w="108" w:type="dxa"/>
             </w:tcMar>
+            <w:vAlign w:val="center"/>
             <w:shd w:val="clear" w:color="auto" w:fill="EBF8F7"/>
           </w:tcPr>
           <w:p>
-            <w:pPr>
-              <w:spacing w:before="40" w:after="40"/>
-            </w:pPr>
             <w:r>
               <w:rPr>
                 <w:b/>
                 <w:color w:val="1E3A5F"/>
-                <w:sz w:val="20"/>
+                <w:sz w:val="19"/>
               </w:rPr>
               <w:t>Timeline</w:t>
             </w:r>
@@ -918,21 +876,19 @@
           <w:tcPr>
             <w:tcW w:type="dxa" w:w="6480"/>
             <w:tcMar>
-              <w:top w:w="120" w:type="dxa"/>
-              <w:bottom w:w="120" w:type="dxa"/>
+              <w:top w:w="36" w:type="dxa"/>
+              <w:bottom w:w="36" w:type="dxa"/>
               <w:left w:w="108" w:type="dxa"/>
               <w:right w:w="108" w:type="dxa"/>
             </w:tcMar>
+            <w:vAlign w:val="center"/>
             <w:shd w:val="clear" w:color="auto" w:fill="EBF8F7"/>
           </w:tcPr>
           <w:p>
-            <w:pPr>
-              <w:spacing w:before="40" w:after="40"/>
-            </w:pPr>
             <w:r>
               <w:rPr>
                 <w:color w:val="111827"/>
-                <w:sz w:val="20"/>
+                <w:sz w:val="19"/>
               </w:rPr>
               <w:t>Wk 1–3: Build &amp; test  |  Wk 4: PE trial run  |  Wk 5: Harden  |  Wk 6: Go-live</w:t>
             </w:r>
@@ -940,26 +896,27 @@
         </w:tc>
       </w:tr>
       <w:tr>
+        <w:trPr>
+          <w:trHeight w:val="432" w:hRule="atLeast"/>
+        </w:trPr>
         <w:tc>
           <w:tcPr>
             <w:tcW w:type="dxa" w:w="2880"/>
             <w:tcMar>
-              <w:top w:w="120" w:type="dxa"/>
-              <w:bottom w:w="120" w:type="dxa"/>
+              <w:top w:w="36" w:type="dxa"/>
+              <w:bottom w:w="36" w:type="dxa"/>
               <w:left w:w="108" w:type="dxa"/>
               <w:right w:w="108" w:type="dxa"/>
             </w:tcMar>
+            <w:vAlign w:val="center"/>
             <w:shd w:val="clear" w:color="auto" w:fill="FFFFFF"/>
           </w:tcPr>
           <w:p>
-            <w:pPr>
-              <w:spacing w:before="40" w:after="40"/>
-            </w:pPr>
             <w:r>
               <w:rPr>
                 <w:b/>
                 <w:color w:val="1E3A5F"/>
-                <w:sz w:val="20"/>
+                <w:sz w:val="19"/>
               </w:rPr>
               <w:t>Physical product</w:t>
             </w:r>
@@ -969,21 +926,495 @@
           <w:tcPr>
             <w:tcW w:type="dxa" w:w="6480"/>
             <w:tcMar>
-              <w:top w:w="120" w:type="dxa"/>
-              <w:bottom w:w="120" w:type="dxa"/>
+              <w:top w:w="36" w:type="dxa"/>
+              <w:bottom w:w="36" w:type="dxa"/>
               <w:left w:w="108" w:type="dxa"/>
               <w:right w:w="108" w:type="dxa"/>
             </w:tcMar>
+            <w:vAlign w:val="center"/>
             <w:shd w:val="clear" w:color="auto" w:fill="FFFFFF"/>
           </w:tcPr>
           <w:p>
-            <w:pPr>
-              <w:spacing w:before="40" w:after="40"/>
-            </w:pPr>
             <w:r>
               <w:rPr>
                 <w:color w:val="111827"/>
-                <w:sz w:val="20"/>
+                <w:sz w:val="19"/>
+              </w:rPr>
+              <w:t>Small folding cartons (~cell phone to paperback size, 1.25–1.75" thick), conveyed flat, narrow edge leading — virus and diagnostic test kits</w:t>
+            </w:r>
+          </w:p>
+        </w:tc>
+      </w:tr>
+    </w:tbl>
+    <w:p/>
+    <w:p>
+      <w:pPr>
+        <w:spacing w:before="200" w:after="60"/>
+      </w:pPr>
+      <w:r>
+        <w:rPr>
+          <w:b/>
+          <w:color w:val="1E3A5F"/>
+          <w:sz w:val="20"/>
+        </w:rPr>
+        <w:t>Option C — min row height 0.40 in, text centred  (≈ +90% on single-line rows)</w:t>
+      </w:r>
+    </w:p>
+    <w:tbl>
+      <w:tblPr>
+        <w:tblStyle w:val="TableGrid"/>
+        <w:tblW w:type="auto" w:w="0"/>
+        <w:tblLook w:firstColumn="1" w:firstRow="1" w:lastColumn="0" w:lastRow="0" w:noHBand="0" w:noVBand="1" w:val="04A0"/>
+      </w:tblPr>
+      <w:tblGrid>
+        <w:gridCol w:w="4680"/>
+        <w:gridCol w:w="4680"/>
+      </w:tblGrid>
+      <w:tr>
+        <w:trPr>
+          <w:trHeight w:val="576" w:hRule="atLeast"/>
+        </w:trPr>
+        <w:tc>
+          <w:tcPr>
+            <w:tcW w:type="dxa" w:w="2880"/>
+            <w:tcMar>
+              <w:top w:w="36" w:type="dxa"/>
+              <w:bottom w:w="36" w:type="dxa"/>
+              <w:left w:w="108" w:type="dxa"/>
+              <w:right w:w="108" w:type="dxa"/>
+            </w:tcMar>
+            <w:vAlign w:val="center"/>
+            <w:shd w:val="clear" w:color="auto" w:fill="1E3A5F"/>
+          </w:tcPr>
+          <w:p>
+            <w:r>
+              <w:rPr>
+                <w:b/>
+                <w:color w:val="FFFFFF"/>
+                <w:sz w:val="19"/>
+              </w:rPr>
+              <w:t>Parameter</w:t>
+            </w:r>
+          </w:p>
+        </w:tc>
+        <w:tc>
+          <w:tcPr>
+            <w:tcW w:type="dxa" w:w="6480"/>
+            <w:tcMar>
+              <w:top w:w="36" w:type="dxa"/>
+              <w:bottom w:w="36" w:type="dxa"/>
+              <w:left w:w="108" w:type="dxa"/>
+              <w:right w:w="108" w:type="dxa"/>
+            </w:tcMar>
+            <w:vAlign w:val="center"/>
+            <w:shd w:val="clear" w:color="auto" w:fill="1E3A5F"/>
+          </w:tcPr>
+          <w:p>
+            <w:r>
+              <w:rPr>
+                <w:b/>
+                <w:color w:val="FFFFFF"/>
+                <w:sz w:val="19"/>
+              </w:rPr>
+              <w:t>Value</w:t>
+            </w:r>
+          </w:p>
+        </w:tc>
+      </w:tr>
+      <w:tr>
+        <w:trPr>
+          <w:trHeight w:val="576" w:hRule="atLeast"/>
+        </w:trPr>
+        <w:tc>
+          <w:tcPr>
+            <w:tcW w:type="dxa" w:w="2880"/>
+            <w:tcMar>
+              <w:top w:w="36" w:type="dxa"/>
+              <w:bottom w:w="36" w:type="dxa"/>
+              <w:left w:w="108" w:type="dxa"/>
+              <w:right w:w="108" w:type="dxa"/>
+            </w:tcMar>
+            <w:vAlign w:val="center"/>
+            <w:shd w:val="clear" w:color="auto" w:fill="EBF8F7"/>
+          </w:tcPr>
+          <w:p>
+            <w:r>
+              <w:rPr>
+                <w:b/>
+                <w:color w:val="1E3A5F"/>
+                <w:sz w:val="19"/>
+              </w:rPr>
+              <w:t>Target application</w:t>
+            </w:r>
+          </w:p>
+        </w:tc>
+        <w:tc>
+          <w:tcPr>
+            <w:tcW w:type="dxa" w:w="6480"/>
+            <w:tcMar>
+              <w:top w:w="36" w:type="dxa"/>
+              <w:bottom w:w="36" w:type="dxa"/>
+              <w:left w:w="108" w:type="dxa"/>
+              <w:right w:w="108" w:type="dxa"/>
+            </w:tcMar>
+            <w:vAlign w:val="center"/>
+            <w:shd w:val="clear" w:color="auto" w:fill="EBF8F7"/>
+          </w:tcPr>
+          <w:p>
+            <w:r>
+              <w:rPr>
+                <w:color w:val="111827"/>
+                <w:sz w:val="19"/>
+              </w:rPr>
+              <w:t>UDI labeling inline inspection — single station, single scan lane</w:t>
+            </w:r>
+          </w:p>
+        </w:tc>
+      </w:tr>
+      <w:tr>
+        <w:trPr>
+          <w:trHeight w:val="576" w:hRule="atLeast"/>
+        </w:trPr>
+        <w:tc>
+          <w:tcPr>
+            <w:tcW w:type="dxa" w:w="2880"/>
+            <w:tcMar>
+              <w:top w:w="36" w:type="dxa"/>
+              <w:bottom w:w="36" w:type="dxa"/>
+              <w:left w:w="108" w:type="dxa"/>
+              <w:right w:w="108" w:type="dxa"/>
+            </w:tcMar>
+            <w:vAlign w:val="center"/>
+            <w:shd w:val="clear" w:color="auto" w:fill="FFFFFF"/>
+          </w:tcPr>
+          <w:p>
+            <w:r>
+              <w:rPr>
+                <w:b/>
+                <w:color w:val="1E3A5F"/>
+                <w:sz w:val="19"/>
+              </w:rPr>
+              <w:t>Scanner</w:t>
+            </w:r>
+          </w:p>
+        </w:tc>
+        <w:tc>
+          <w:tcPr>
+            <w:tcW w:type="dxa" w:w="6480"/>
+            <w:tcMar>
+              <w:top w:w="36" w:type="dxa"/>
+              <w:bottom w:w="36" w:type="dxa"/>
+              <w:left w:w="108" w:type="dxa"/>
+              <w:right w:w="108" w:type="dxa"/>
+            </w:tcMar>
+            <w:vAlign w:val="center"/>
+            <w:shd w:val="clear" w:color="auto" w:fill="FFFFFF"/>
+          </w:tcPr>
+          <w:p>
+            <w:r>
+              <w:rPr>
+                <w:color w:val="111827"/>
+                <w:sz w:val="19"/>
+              </w:rPr>
+              <w:t>Cognex DM-475V-LBL on desktop stand adapted for conveyor use</w:t>
+            </w:r>
+          </w:p>
+        </w:tc>
+      </w:tr>
+      <w:tr>
+        <w:trPr>
+          <w:trHeight w:val="576" w:hRule="atLeast"/>
+        </w:trPr>
+        <w:tc>
+          <w:tcPr>
+            <w:tcW w:type="dxa" w:w="2880"/>
+            <w:tcMar>
+              <w:top w:w="36" w:type="dxa"/>
+              <w:bottom w:w="36" w:type="dxa"/>
+              <w:left w:w="108" w:type="dxa"/>
+              <w:right w:w="108" w:type="dxa"/>
+            </w:tcMar>
+            <w:vAlign w:val="center"/>
+            <w:shd w:val="clear" w:color="auto" w:fill="EBF8F7"/>
+          </w:tcPr>
+          <w:p>
+            <w:r>
+              <w:rPr>
+                <w:b/>
+                <w:color w:val="1E3A5F"/>
+                <w:sz w:val="19"/>
+              </w:rPr>
+              <w:t>Barcode type</w:t>
+            </w:r>
+          </w:p>
+        </w:tc>
+        <w:tc>
+          <w:tcPr>
+            <w:tcW w:type="dxa" w:w="6480"/>
+            <w:tcMar>
+              <w:top w:w="36" w:type="dxa"/>
+              <w:bottom w:w="36" w:type="dxa"/>
+              <w:left w:w="108" w:type="dxa"/>
+              <w:right w:w="108" w:type="dxa"/>
+            </w:tcMar>
+            <w:vAlign w:val="center"/>
+            <w:shd w:val="clear" w:color="auto" w:fill="EBF8F7"/>
+          </w:tcPr>
+          <w:p>
+            <w:r>
+              <w:rPr>
+                <w:color w:val="111827"/>
+                <w:sz w:val="19"/>
+              </w:rPr>
+              <w:t>GS1 DataMatrix only</w:t>
+            </w:r>
+          </w:p>
+        </w:tc>
+      </w:tr>
+      <w:tr>
+        <w:trPr>
+          <w:trHeight w:val="576" w:hRule="atLeast"/>
+        </w:trPr>
+        <w:tc>
+          <w:tcPr>
+            <w:tcW w:type="dxa" w:w="2880"/>
+            <w:tcMar>
+              <w:top w:w="36" w:type="dxa"/>
+              <w:bottom w:w="36" w:type="dxa"/>
+              <w:left w:w="108" w:type="dxa"/>
+              <w:right w:w="108" w:type="dxa"/>
+            </w:tcMar>
+            <w:vAlign w:val="center"/>
+            <w:shd w:val="clear" w:color="auto" w:fill="FFFFFF"/>
+          </w:tcPr>
+          <w:p>
+            <w:r>
+              <w:rPr>
+                <w:b/>
+                <w:color w:val="1E3A5F"/>
+                <w:sz w:val="19"/>
+              </w:rPr>
+              <w:t>Trigger mode</w:t>
+            </w:r>
+          </w:p>
+        </w:tc>
+        <w:tc>
+          <w:tcPr>
+            <w:tcW w:type="dxa" w:w="6480"/>
+            <w:tcMar>
+              <w:top w:w="36" w:type="dxa"/>
+              <w:bottom w:w="36" w:type="dxa"/>
+              <w:left w:w="108" w:type="dxa"/>
+              <w:right w:w="108" w:type="dxa"/>
+            </w:tcMar>
+            <w:vAlign w:val="center"/>
+            <w:shd w:val="clear" w:color="auto" w:fill="FFFFFF"/>
+          </w:tcPr>
+          <w:p>
+            <w:r>
+              <w:rPr>
+                <w:color w:val="111827"/>
+                <w:sz w:val="19"/>
+              </w:rPr>
+              <w:t>Photosensor hardware item-presence (default); auto-cycle and manual also supported</w:t>
+            </w:r>
+          </w:p>
+        </w:tc>
+      </w:tr>
+      <w:tr>
+        <w:trPr>
+          <w:trHeight w:val="576" w:hRule="atLeast"/>
+        </w:trPr>
+        <w:tc>
+          <w:tcPr>
+            <w:tcW w:type="dxa" w:w="2880"/>
+            <w:tcMar>
+              <w:top w:w="36" w:type="dxa"/>
+              <w:bottom w:w="36" w:type="dxa"/>
+              <w:left w:w="108" w:type="dxa"/>
+              <w:right w:w="108" w:type="dxa"/>
+            </w:tcMar>
+            <w:vAlign w:val="center"/>
+            <w:shd w:val="clear" w:color="auto" w:fill="EBF8F7"/>
+          </w:tcPr>
+          <w:p>
+            <w:r>
+              <w:rPr>
+                <w:b/>
+                <w:color w:val="1E3A5F"/>
+                <w:sz w:val="19"/>
+              </w:rPr>
+              <w:t>Indicator pole</w:t>
+            </w:r>
+          </w:p>
+        </w:tc>
+        <w:tc>
+          <w:tcPr>
+            <w:tcW w:type="dxa" w:w="6480"/>
+            <w:tcMar>
+              <w:top w:w="36" w:type="dxa"/>
+              <w:bottom w:w="36" w:type="dxa"/>
+              <w:left w:w="108" w:type="dxa"/>
+              <w:right w:w="108" w:type="dxa"/>
+            </w:tcMar>
+            <w:vAlign w:val="center"/>
+            <w:shd w:val="clear" w:color="auto" w:fill="EBF8F7"/>
+          </w:tcPr>
+          <w:p>
+            <w:r>
+              <w:rPr>
+                <w:color w:val="111827"/>
+                <w:sz w:val="19"/>
+              </w:rPr>
+              <w:t>3–5 segment light pole with per-color steady/flash states; audible alarm — TBD Engineering</w:t>
+            </w:r>
+          </w:p>
+        </w:tc>
+      </w:tr>
+      <w:tr>
+        <w:trPr>
+          <w:trHeight w:val="576" w:hRule="atLeast"/>
+        </w:trPr>
+        <w:tc>
+          <w:tcPr>
+            <w:tcW w:type="dxa" w:w="2880"/>
+            <w:tcMar>
+              <w:top w:w="36" w:type="dxa"/>
+              <w:bottom w:w="36" w:type="dxa"/>
+              <w:left w:w="108" w:type="dxa"/>
+              <w:right w:w="108" w:type="dxa"/>
+            </w:tcMar>
+            <w:vAlign w:val="center"/>
+            <w:shd w:val="clear" w:color="auto" w:fill="FFFFFF"/>
+          </w:tcPr>
+          <w:p>
+            <w:r>
+              <w:rPr>
+                <w:b/>
+                <w:color w:val="1E3A5F"/>
+                <w:sz w:val="19"/>
+              </w:rPr>
+              <w:t>Conveyor control</w:t>
+            </w:r>
+          </w:p>
+        </w:tc>
+        <w:tc>
+          <w:tcPr>
+            <w:tcW w:type="dxa" w:w="6480"/>
+            <w:tcMar>
+              <w:top w:w="36" w:type="dxa"/>
+              <w:bottom w:w="36" w:type="dxa"/>
+              <w:left w:w="108" w:type="dxa"/>
+              <w:right w:w="108" w:type="dxa"/>
+            </w:tcMar>
+            <w:vAlign w:val="center"/>
+            <w:shd w:val="clear" w:color="auto" w:fill="FFFFFF"/>
+          </w:tcPr>
+          <w:p>
+            <w:r>
+              <w:rPr>
+                <w:color w:val="111827"/>
+                <w:sz w:val="19"/>
+              </w:rPr>
+              <w:t>Pusher divert on fail; line-stop behaviour TBD Engineering</w:t>
+            </w:r>
+          </w:p>
+        </w:tc>
+      </w:tr>
+      <w:tr>
+        <w:trPr>
+          <w:trHeight w:val="576" w:hRule="atLeast"/>
+        </w:trPr>
+        <w:tc>
+          <w:tcPr>
+            <w:tcW w:type="dxa" w:w="2880"/>
+            <w:tcMar>
+              <w:top w:w="36" w:type="dxa"/>
+              <w:bottom w:w="36" w:type="dxa"/>
+              <w:left w:w="108" w:type="dxa"/>
+              <w:right w:w="108" w:type="dxa"/>
+            </w:tcMar>
+            <w:vAlign w:val="center"/>
+            <w:shd w:val="clear" w:color="auto" w:fill="EBF8F7"/>
+          </w:tcPr>
+          <w:p>
+            <w:r>
+              <w:rPr>
+                <w:b/>
+                <w:color w:val="1E3A5F"/>
+                <w:sz w:val="19"/>
+              </w:rPr>
+              <w:t>Timeline</w:t>
+            </w:r>
+          </w:p>
+        </w:tc>
+        <w:tc>
+          <w:tcPr>
+            <w:tcW w:type="dxa" w:w="6480"/>
+            <w:tcMar>
+              <w:top w:w="36" w:type="dxa"/>
+              <w:bottom w:w="36" w:type="dxa"/>
+              <w:left w:w="108" w:type="dxa"/>
+              <w:right w:w="108" w:type="dxa"/>
+            </w:tcMar>
+            <w:vAlign w:val="center"/>
+            <w:shd w:val="clear" w:color="auto" w:fill="EBF8F7"/>
+          </w:tcPr>
+          <w:p>
+            <w:r>
+              <w:rPr>
+                <w:color w:val="111827"/>
+                <w:sz w:val="19"/>
+              </w:rPr>
+              <w:t>Wk 1–3: Build &amp; test  |  Wk 4: PE trial run  |  Wk 5: Harden  |  Wk 6: Go-live</w:t>
+            </w:r>
+          </w:p>
+        </w:tc>
+      </w:tr>
+      <w:tr>
+        <w:trPr>
+          <w:trHeight w:val="576" w:hRule="atLeast"/>
+        </w:trPr>
+        <w:tc>
+          <w:tcPr>
+            <w:tcW w:type="dxa" w:w="2880"/>
+            <w:tcMar>
+              <w:top w:w="36" w:type="dxa"/>
+              <w:bottom w:w="36" w:type="dxa"/>
+              <w:left w:w="108" w:type="dxa"/>
+              <w:right w:w="108" w:type="dxa"/>
+            </w:tcMar>
+            <w:vAlign w:val="center"/>
+            <w:shd w:val="clear" w:color="auto" w:fill="FFFFFF"/>
+          </w:tcPr>
+          <w:p>
+            <w:r>
+              <w:rPr>
+                <w:b/>
+                <w:color w:val="1E3A5F"/>
+                <w:sz w:val="19"/>
+              </w:rPr>
+              <w:t>Physical product</w:t>
+            </w:r>
+          </w:p>
+        </w:tc>
+        <w:tc>
+          <w:tcPr>
+            <w:tcW w:type="dxa" w:w="6480"/>
+            <w:tcMar>
+              <w:top w:w="36" w:type="dxa"/>
+              <w:bottom w:w="36" w:type="dxa"/>
+              <w:left w:w="108" w:type="dxa"/>
+              <w:right w:w="108" w:type="dxa"/>
+            </w:tcMar>
+            <w:vAlign w:val="center"/>
+            <w:shd w:val="clear" w:color="auto" w:fill="FFFFFF"/>
+          </w:tcPr>
+          <w:p>
+            <w:r>
+              <w:rPr>
+                <w:color w:val="111827"/>
+                <w:sz w:val="19"/>
               </w:rPr>
               <w:t>Small folding cartons (~cell phone to paperback size, 1.25–1.75" thick), conveyed flat, narrow edge leading — virus and diagnostic test kits</w:t>
             </w:r>

</xml_diff>